<commit_message>
docs(cimmra): cover ZFI_CIMMRA_VENDOR_EXT in the assessment document
Adds the sixth program, ZFI_CIMMRA_VENDOR_EXT, to the customer-facing
assessment. It is the one program of the six that must be rewritten
rather than adapted: it drives CALL TRANSACTION 'XK01' against the
SAPMF02K module pool and the SAPLJ1I_MASTER CIN screens, none of which
exist in S/4HANA.

- section 2: add the program to the inventory
- section 3: qualify the "adaptation, not rewrite" statement
- section 5.6: screen-by-screen table mapping each BDC screen to its
  CL_MD_BP_MAINTAIN node, plus the two open decision points
- section 6: revised effort table
- Q7: which fields are to be copied from the reference vendor, since
  the API has no XK01-style copy-from-reference feature
- R6/R7: how ZFI_TAX_TAB is to be filled once its XK01 screen
  enhancement is gone

Co-Authored-By: Claude Opus 5 <noreply@anthropic.com>
Claude-Session: https://claude.ai/code/session_01ExrHE2iD52RuBywzwgwm2S
</commit_message>
<xml_diff>
--- a/docs/cimmra/Cimmra_Vendor_Interface_S4HANA_BP_Assessment.docx
+++ b/docs/cimmra/Cimmra_Vendor_Interface_S4HANA_BP_Assessment.docx
@@ -160,7 +160,7 @@
               <w:rPr>
                 <w:sz w:val="19"/>
               </w:rPr>
-              <w:t>Programs and design document received 07.09.2026</w:t>
+              <w:t>Six programs and the design document received 07.09.2026, ZFI_CIMMRA_VENDOR_EXT received 08.09.2026</w:t>
             </w:r>
           </w:p>
         </w:tc>
@@ -231,6 +231,15 @@
           <w:i w:val="0"/>
         </w:rPr>
         <w:t>Section 8 lists what we need from Cipla before development starts.</w:t>
+      </w:r>
+    </w:p>
+    <w:p>
+      <w:r>
+        <w:rPr>
+          <w:b w:val="0"/>
+          <w:i/>
+        </w:rPr>
+        <w:t>ZFI_CIMMRA_VENDOR_EXT was received after the first draft of this document and is covered in section 5.6. It is the one program that has to be rewritten.</w:t>
       </w:r>
     </w:p>
     <w:p>
@@ -487,6 +496,50 @@
               <w:rPr>
                 <w:sz w:val="19"/>
               </w:rPr>
+              <w:t>ZFI_CIMMRA_VENDOR_EXT</w:t>
+            </w:r>
+          </w:p>
+        </w:tc>
+        <w:tc>
+          <w:tcPr>
+            <w:tcW w:type="dxa" w:w="1814"/>
+          </w:tcPr>
+          <w:p>
+            <w:r/>
+            <w:r>
+              <w:rPr>
+                <w:sz w:val="19"/>
+              </w:rPr>
+              <w:t>Report</w:t>
+            </w:r>
+          </w:p>
+        </w:tc>
+        <w:tc>
+          <w:tcPr>
+            <w:tcW w:type="dxa" w:w="4139"/>
+          </w:tcPr>
+          <w:p>
+            <w:r/>
+            <w:r>
+              <w:rPr>
+                <w:sz w:val="19"/>
+              </w:rPr>
+              <w:t>Extends a vendor to a further company code and purchasing organisation</w:t>
+            </w:r>
+          </w:p>
+        </w:tc>
+      </w:tr>
+      <w:tr>
+        <w:tc>
+          <w:tcPr>
+            <w:tcW w:type="dxa" w:w="3402"/>
+          </w:tcPr>
+          <w:p>
+            <w:r/>
+            <w:r>
+              <w:rPr>
+                <w:sz w:val="19"/>
+              </w:rPr>
               <w:t>ZMM_RFC_VENDOR_CREATE</w:t>
             </w:r>
           </w:p>
@@ -616,7 +669,7 @@
           <w:b/>
           <w:i w:val="0"/>
         </w:rPr>
-        <w:t>This is not a rewrite. The work is well defined and the pattern is one we have already built and run in an S/4HANA system.</w:t>
+        <w:t>That holds for five of the six programs. The exception is ZFI_CIMMRA_VENDOR_EXT, which does not use the interface structures at all - it drives transaction XK01 through a batch input recording. XK01 does not exist in S/4HANA, so that one program is rewritten rather than adapted. Section 5.6 sets out what it does today and what replaces it.</w:t>
       </w:r>
     </w:p>
     <w:p>
@@ -2209,7 +2262,561 @@
           <w:b w:val="0"/>
           <w:i w:val="0"/>
         </w:rPr>
-        <w:t>Named in the design document as the vendor extension program, but not included in the material received. See question Q5.</w:t>
+        <w:t>This program is the exception. It does not call the function modules and it does not use the interface structures. It builds a batch input recording and runs it through transaction XK01 - screens 0100, 0210, 0215, 0220, 0310, 0610 and 4000 of module pool SAPMF02K, and screen 0100 of SAPLJ1I_MASTER for the CIN data.</w:t>
+      </w:r>
+    </w:p>
+    <w:p>
+      <w:r>
+        <w:rPr>
+          <w:b/>
+          <w:i w:val="0"/>
+        </w:rPr>
+        <w:t>Neither XK01 nor SAPMF02K exists in S/4HANA. The Business Partner is the single point of entry for supplier master data, and the CIN master screens were removed when those fields moved onto LFA1. The program therefore stops working at the conversion, and is rewritten rather than adapted.</w:t>
+      </w:r>
+    </w:p>
+    <w:p>
+      <w:r>
+        <w:rPr>
+          <w:b w:val="0"/>
+          <w:i w:val="0"/>
+        </w:rPr>
+        <w:t>The rewrite is not large, because the field set is small. What the recording sets today is:</w:t>
+      </w:r>
+    </w:p>
+    <w:tbl>
+      <w:tblPr>
+        <w:tblStyle w:val="LightGrid-Accent1"/>
+        <w:tblW w:type="auto" w:w="0"/>
+        <w:jc w:val="left"/>
+        <w:tblLook w:firstColumn="1" w:firstRow="1" w:lastColumn="0" w:lastRow="0" w:noHBand="0" w:noVBand="1" w:val="04A0"/>
+      </w:tblPr>
+      <w:tblGrid>
+        <w:gridCol w:w="3324"/>
+        <w:gridCol w:w="3324"/>
+        <w:gridCol w:w="3324"/>
+      </w:tblGrid>
+      <w:tr>
+        <w:tc>
+          <w:tcPr>
+            <w:tcW w:type="dxa" w:w="1587"/>
+          </w:tcPr>
+          <w:p>
+            <w:r/>
+            <w:r>
+              <w:rPr>
+                <w:b/>
+                <w:sz w:val="19"/>
+              </w:rPr>
+              <w:t>Screen</w:t>
+            </w:r>
+          </w:p>
+        </w:tc>
+        <w:tc>
+          <w:tcPr>
+            <w:tcW w:type="dxa" w:w="4195"/>
+          </w:tcPr>
+          <w:p>
+            <w:r/>
+            <w:r>
+              <w:rPr>
+                <w:b/>
+                <w:sz w:val="19"/>
+              </w:rPr>
+              <w:t>What it sets</w:t>
+            </w:r>
+          </w:p>
+        </w:tc>
+        <w:tc>
+          <w:tcPr>
+            <w:tcW w:type="dxa" w:w="3572"/>
+          </w:tcPr>
+          <w:p>
+            <w:r/>
+            <w:r>
+              <w:rPr>
+                <w:b/>
+                <w:sz w:val="19"/>
+              </w:rPr>
+              <w:t>Replaced by</w:t>
+            </w:r>
+          </w:p>
+        </w:tc>
+      </w:tr>
+      <w:tr>
+        <w:tc>
+          <w:tcPr>
+            <w:tcW w:type="dxa" w:w="1587"/>
+          </w:tcPr>
+          <w:p>
+            <w:r/>
+            <w:r>
+              <w:rPr>
+                <w:sz w:val="19"/>
+              </w:rPr>
+              <w:t>0100</w:t>
+            </w:r>
+          </w:p>
+        </w:tc>
+        <w:tc>
+          <w:tcPr>
+            <w:tcW w:type="dxa" w:w="4195"/>
+          </w:tcPr>
+          <w:p>
+            <w:r/>
+            <w:r>
+              <w:rPr>
+                <w:sz w:val="19"/>
+              </w:rPr>
+              <w:t>Vendor, company code, purchasing organisation, account group, and the reference vendor with its company code and purchasing organisation</w:t>
+            </w:r>
+          </w:p>
+        </w:tc>
+        <w:tc>
+          <w:tcPr>
+            <w:tcW w:type="dxa" w:w="3572"/>
+          </w:tcPr>
+          <w:p>
+            <w:r/>
+            <w:r>
+              <w:rPr>
+                <w:sz w:val="19"/>
+              </w:rPr>
+              <w:t>The key of the message, and a read of the reference - see the note below</w:t>
+            </w:r>
+          </w:p>
+        </w:tc>
+      </w:tr>
+      <w:tr>
+        <w:tc>
+          <w:tcPr>
+            <w:tcW w:type="dxa" w:w="1587"/>
+          </w:tcPr>
+          <w:p>
+            <w:r/>
+            <w:r>
+              <w:rPr>
+                <w:sz w:val="19"/>
+              </w:rPr>
+              <w:t>0210</w:t>
+            </w:r>
+          </w:p>
+        </w:tc>
+        <w:tc>
+          <w:tcPr>
+            <w:tcW w:type="dxa" w:w="4195"/>
+          </w:tcPr>
+          <w:p>
+            <w:r/>
+            <w:r>
+              <w:rPr>
+                <w:sz w:val="19"/>
+              </w:rPr>
+              <w:t>Reconciliation account, previous account number</w:t>
+            </w:r>
+          </w:p>
+        </w:tc>
+        <w:tc>
+          <w:tcPr>
+            <w:tcW w:type="dxa" w:w="3572"/>
+          </w:tcPr>
+          <w:p>
+            <w:r/>
+            <w:r>
+              <w:rPr>
+                <w:sz w:val="19"/>
+              </w:rPr>
+              <w:t>Company code node</w:t>
+            </w:r>
+          </w:p>
+        </w:tc>
+      </w:tr>
+      <w:tr>
+        <w:tc>
+          <w:tcPr>
+            <w:tcW w:type="dxa" w:w="1587"/>
+          </w:tcPr>
+          <w:p>
+            <w:r/>
+            <w:r>
+              <w:rPr>
+                <w:sz w:val="19"/>
+              </w:rPr>
+              <w:t>0215</w:t>
+            </w:r>
+          </w:p>
+        </w:tc>
+        <w:tc>
+          <w:tcPr>
+            <w:tcW w:type="dxa" w:w="4195"/>
+          </w:tcPr>
+          <w:p>
+            <w:r/>
+            <w:r>
+              <w:rPr>
+                <w:sz w:val="19"/>
+              </w:rPr>
+              <w:t>Terms of payment, payment history indicator, payment methods</w:t>
+            </w:r>
+          </w:p>
+        </w:tc>
+        <w:tc>
+          <w:tcPr>
+            <w:tcW w:type="dxa" w:w="3572"/>
+          </w:tcPr>
+          <w:p>
+            <w:r/>
+            <w:r>
+              <w:rPr>
+                <w:sz w:val="19"/>
+              </w:rPr>
+              <w:t>Company code node</w:t>
+            </w:r>
+          </w:p>
+        </w:tc>
+      </w:tr>
+      <w:tr>
+        <w:tc>
+          <w:tcPr>
+            <w:tcW w:type="dxa" w:w="1587"/>
+          </w:tcPr>
+          <w:p>
+            <w:r/>
+            <w:r>
+              <w:rPr>
+                <w:sz w:val="19"/>
+              </w:rPr>
+              <w:t>0610</w:t>
+            </w:r>
+          </w:p>
+        </w:tc>
+        <w:tc>
+          <w:tcPr>
+            <w:tcW w:type="dxa" w:w="4195"/>
+          </w:tcPr>
+          <w:p>
+            <w:r/>
+            <w:r>
+              <w:rPr>
+                <w:sz w:val="19"/>
+              </w:rPr>
+              <w:t>Withholding tax country. The withholding tax lines themselves are commented out in the recording, so no tax type is extended today.</w:t>
+            </w:r>
+          </w:p>
+        </w:tc>
+        <w:tc>
+          <w:tcPr>
+            <w:tcW w:type="dxa" w:w="3572"/>
+          </w:tcPr>
+          <w:p>
+            <w:r/>
+            <w:r>
+              <w:rPr>
+                <w:sz w:val="19"/>
+              </w:rPr>
+              <w:t>Company code node</w:t>
+            </w:r>
+          </w:p>
+        </w:tc>
+      </w:tr>
+      <w:tr>
+        <w:tc>
+          <w:tcPr>
+            <w:tcW w:type="dxa" w:w="1587"/>
+          </w:tcPr>
+          <w:p>
+            <w:r/>
+            <w:r>
+              <w:rPr>
+                <w:sz w:val="19"/>
+              </w:rPr>
+              <w:t>0310</w:t>
+            </w:r>
+          </w:p>
+        </w:tc>
+        <w:tc>
+          <w:tcPr>
+            <w:tcW w:type="dxa" w:w="4195"/>
+          </w:tcPr>
+          <w:p>
+            <w:r/>
+            <w:r>
+              <w:rPr>
+                <w:sz w:val="19"/>
+              </w:rPr>
+              <w:t>Purchasing currency and telephone</w:t>
+            </w:r>
+          </w:p>
+        </w:tc>
+        <w:tc>
+          <w:tcPr>
+            <w:tcW w:type="dxa" w:w="3572"/>
+          </w:tcPr>
+          <w:p>
+            <w:r/>
+            <w:r>
+              <w:rPr>
+                <w:sz w:val="19"/>
+              </w:rPr>
+              <w:t>Purchasing organisation node</w:t>
+            </w:r>
+          </w:p>
+        </w:tc>
+      </w:tr>
+      <w:tr>
+        <w:tc>
+          <w:tcPr>
+            <w:tcW w:type="dxa" w:w="1587"/>
+          </w:tcPr>
+          <w:p>
+            <w:r/>
+            <w:r>
+              <w:rPr>
+                <w:sz w:val="19"/>
+              </w:rPr>
+              <w:t>4000</w:t>
+            </w:r>
+          </w:p>
+        </w:tc>
+        <w:tc>
+          <w:tcPr>
+            <w:tcW w:type="dxa" w:w="4195"/>
+          </w:tcPr>
+          <w:p>
+            <w:r/>
+            <w:r>
+              <w:rPr>
+                <w:sz w:val="19"/>
+              </w:rPr>
+              <w:t>Three indicators on the custom table ZFI_TAX_TAB</w:t>
+            </w:r>
+          </w:p>
+        </w:tc>
+        <w:tc>
+          <w:tcPr>
+            <w:tcW w:type="dxa" w:w="3572"/>
+          </w:tcPr>
+          <w:p>
+            <w:r/>
+            <w:r>
+              <w:rPr>
+                <w:sz w:val="19"/>
+              </w:rPr>
+              <w:t>See the note below</w:t>
+            </w:r>
+          </w:p>
+        </w:tc>
+      </w:tr>
+      <w:tr>
+        <w:tc>
+          <w:tcPr>
+            <w:tcW w:type="dxa" w:w="1587"/>
+          </w:tcPr>
+          <w:p>
+            <w:r/>
+            <w:r>
+              <w:rPr>
+                <w:sz w:val="19"/>
+              </w:rPr>
+              <w:t>SAPLJ1I_MASTER</w:t>
+            </w:r>
+          </w:p>
+        </w:tc>
+        <w:tc>
+          <w:tcPr>
+            <w:tcW w:type="dxa" w:w="4195"/>
+          </w:tcPr>
+          <w:p>
+            <w:r/>
+            <w:r>
+              <w:rPr>
+                <w:sz w:val="19"/>
+              </w:rPr>
+              <w:t>PAN number and SSI status</w:t>
+            </w:r>
+          </w:p>
+        </w:tc>
+        <w:tc>
+          <w:tcPr>
+            <w:tcW w:type="dxa" w:w="3572"/>
+          </w:tcPr>
+          <w:p>
+            <w:r/>
+            <w:r>
+              <w:rPr>
+                <w:sz w:val="19"/>
+              </w:rPr>
+              <w:t>General data - these are LFA1 fields in S/4HANA</w:t>
+            </w:r>
+          </w:p>
+        </w:tc>
+      </w:tr>
+    </w:tbl>
+    <w:p/>
+    <w:p>
+      <w:r>
+        <w:rPr>
+          <w:b/>
+          <w:i w:val="0"/>
+        </w:rPr>
+        <w:t>Two points need a decision rather than only development.</w:t>
+      </w:r>
+    </w:p>
+    <w:tbl>
+      <w:tblPr>
+        <w:tblStyle w:val="LightGrid-Accent1"/>
+        <w:tblW w:type="auto" w:w="0"/>
+        <w:jc w:val="left"/>
+        <w:tblLook w:firstColumn="1" w:firstRow="1" w:lastColumn="0" w:lastRow="0" w:noHBand="0" w:noVBand="1" w:val="04A0"/>
+      </w:tblPr>
+      <w:tblGrid>
+        <w:gridCol w:w="3324"/>
+        <w:gridCol w:w="3324"/>
+        <w:gridCol w:w="3324"/>
+      </w:tblGrid>
+      <w:tr>
+        <w:tc>
+          <w:tcPr>
+            <w:tcW w:type="dxa" w:w="737"/>
+          </w:tcPr>
+          <w:p>
+            <w:r/>
+            <w:r>
+              <w:rPr>
+                <w:b/>
+                <w:sz w:val="19"/>
+              </w:rPr>
+              <w:t>#</w:t>
+            </w:r>
+          </w:p>
+        </w:tc>
+        <w:tc>
+          <w:tcPr>
+            <w:tcW w:type="dxa" w:w="2494"/>
+          </w:tcPr>
+          <w:p>
+            <w:r/>
+            <w:r>
+              <w:rPr>
+                <w:b/>
+                <w:sz w:val="19"/>
+              </w:rPr>
+              <w:t>Point</w:t>
+            </w:r>
+          </w:p>
+        </w:tc>
+        <w:tc>
+          <w:tcPr>
+            <w:tcW w:type="dxa" w:w="6123"/>
+          </w:tcPr>
+          <w:p>
+            <w:r/>
+            <w:r>
+              <w:rPr>
+                <w:b/>
+                <w:sz w:val="19"/>
+              </w:rPr>
+              <w:t>What it means</w:t>
+            </w:r>
+          </w:p>
+        </w:tc>
+      </w:tr>
+      <w:tr>
+        <w:tc>
+          <w:tcPr>
+            <w:tcW w:type="dxa" w:w="737"/>
+          </w:tcPr>
+          <w:p>
+            <w:r/>
+            <w:r>
+              <w:rPr>
+                <w:sz w:val="19"/>
+              </w:rPr>
+              <w:t>A</w:t>
+            </w:r>
+          </w:p>
+        </w:tc>
+        <w:tc>
+          <w:tcPr>
+            <w:tcW w:type="dxa" w:w="2494"/>
+          </w:tcPr>
+          <w:p>
+            <w:r/>
+            <w:r>
+              <w:rPr>
+                <w:sz w:val="19"/>
+              </w:rPr>
+              <w:t>The reference vendor</w:t>
+            </w:r>
+          </w:p>
+        </w:tc>
+        <w:tc>
+          <w:tcPr>
+            <w:tcW w:type="dxa" w:w="6123"/>
+          </w:tcPr>
+          <w:p>
+            <w:r/>
+            <w:r>
+              <w:rPr>
+                <w:sz w:val="19"/>
+              </w:rPr>
+              <w:t>On the screen, naming a reference vendor copies everything the reference has. The Business Partner interface has no such feature. The new program reads the reference itself and carries the values across - but only the fields it reads. Which fields are to be copied has to be agreed. See question Q7.</w:t>
+            </w:r>
+          </w:p>
+        </w:tc>
+      </w:tr>
+      <w:tr>
+        <w:tc>
+          <w:tcPr>
+            <w:tcW w:type="dxa" w:w="737"/>
+          </w:tcPr>
+          <w:p>
+            <w:r/>
+            <w:r>
+              <w:rPr>
+                <w:sz w:val="19"/>
+              </w:rPr>
+              <w:t>B</w:t>
+            </w:r>
+          </w:p>
+        </w:tc>
+        <w:tc>
+          <w:tcPr>
+            <w:tcW w:type="dxa" w:w="2494"/>
+          </w:tcPr>
+          <w:p>
+            <w:r/>
+            <w:r>
+              <w:rPr>
+                <w:sz w:val="19"/>
+              </w:rPr>
+              <w:t>ZFI_TAX_TAB</w:t>
+            </w:r>
+          </w:p>
+        </w:tc>
+        <w:tc>
+          <w:tcPr>
+            <w:tcW w:type="dxa" w:w="6123"/>
+          </w:tcPr>
+          <w:p>
+            <w:r/>
+            <w:r>
+              <w:rPr>
+                <w:sz w:val="19"/>
+              </w:rPr>
+              <w:t>A custom table filled today through a screen enhancement on XK01. Without the transaction there is no screen, so the program writes the table itself. This needs the table definition and its update rules. See requirement R7.</w:t>
+            </w:r>
+          </w:p>
+        </w:tc>
+      </w:tr>
+    </w:tbl>
+    <w:p/>
+    <w:p>
+      <w:r>
+        <w:rPr>
+          <w:b w:val="0"/>
+          <w:i w:val="0"/>
+        </w:rPr>
+        <w:t>The program also reads J_1IMOVEND directly, which is obsolete in S/4HANA - those fields are columns of LFA1 now. And the file handling points in 5.3 apply to it as they do to the other reports.</w:t>
       </w:r>
     </w:p>
     <w:p>
@@ -2486,7 +3093,7 @@
               <w:rPr>
                 <w:sz w:val="19"/>
               </w:rPr>
-              <w:t>Cannot be estimated - not received</w:t>
+              <w:t>Rewritten rather than adapted, but the field set is small - comparable to one of the reports</w:t>
             </w:r>
           </w:p>
         </w:tc>
@@ -2850,6 +3457,50 @@
           </w:p>
         </w:tc>
       </w:tr>
+      <w:tr>
+        <w:tc>
+          <w:tcPr>
+            <w:tcW w:type="dxa" w:w="737"/>
+          </w:tcPr>
+          <w:p>
+            <w:r/>
+            <w:r>
+              <w:rPr>
+                <w:sz w:val="19"/>
+              </w:rPr>
+              <w:t>Q7</w:t>
+            </w:r>
+          </w:p>
+        </w:tc>
+        <w:tc>
+          <w:tcPr>
+            <w:tcW w:type="dxa" w:w="4082"/>
+          </w:tcPr>
+          <w:p>
+            <w:r/>
+            <w:r>
+              <w:rPr>
+                <w:sz w:val="19"/>
+              </w:rPr>
+              <w:t>On a vendor extension, which fields should be copied from the reference vendor?</w:t>
+            </w:r>
+          </w:p>
+        </w:tc>
+        <w:tc>
+          <w:tcPr>
+            <w:tcW w:type="dxa" w:w="4535"/>
+          </w:tcPr>
+          <w:p>
+            <w:r/>
+            <w:r>
+              <w:rPr>
+                <w:sz w:val="19"/>
+              </w:rPr>
+              <w:t>Transaction XK01 copied everything the reference had. The Business Partner interface has no reference feature, so the fields to copy have to be named. Our proposal: reconciliation account, terms of payment, payment methods, payment history indicator and planning group from the reference company code, and currency, schema group and GR based invoice verification from the reference purchasing organisation - each overridden by whatever the file supplies.</w:t>
+            </w:r>
+          </w:p>
+        </w:tc>
+      </w:tr>
     </w:tbl>
     <w:p/>
     <w:p>
@@ -2944,50 +3595,6 @@
               <w:rPr>
                 <w:sz w:val="19"/>
               </w:rPr>
-              <w:t>ZFI_CIMMRA_VENDOR_EXT</w:t>
-            </w:r>
-          </w:p>
-        </w:tc>
-        <w:tc>
-          <w:tcPr>
-            <w:tcW w:type="dxa" w:w="4535"/>
-          </w:tcPr>
-          <w:p>
-            <w:r/>
-            <w:r>
-              <w:rPr>
-                <w:sz w:val="19"/>
-              </w:rPr>
-              <w:t>Named in the design document, not received. Vendor extension is a scenario in its own right.</w:t>
-            </w:r>
-          </w:p>
-        </w:tc>
-      </w:tr>
-      <w:tr>
-        <w:tc>
-          <w:tcPr>
-            <w:tcW w:type="dxa" w:w="737"/>
-          </w:tcPr>
-          <w:p>
-            <w:r/>
-            <w:r>
-              <w:rPr>
-                <w:sz w:val="19"/>
-              </w:rPr>
-              <w:t>R2</w:t>
-            </w:r>
-          </w:p>
-        </w:tc>
-        <w:tc>
-          <w:tcPr>
-            <w:tcW w:type="dxa" w:w="4082"/>
-          </w:tcPr>
-          <w:p>
-            <w:r/>
-            <w:r>
-              <w:rPr>
-                <w:sz w:val="19"/>
-              </w:rPr>
               <w:t>The customer programs, if Q4 is yes</w:t>
             </w:r>
           </w:p>
@@ -3018,7 +3625,7 @@
               <w:rPr>
                 <w:sz w:val="19"/>
               </w:rPr>
-              <w:t>R3</w:t>
+              <w:t>R2</w:t>
             </w:r>
           </w:p>
         </w:tc>
@@ -3062,7 +3669,7 @@
               <w:rPr>
                 <w:sz w:val="19"/>
               </w:rPr>
-              <w:t>R4</w:t>
+              <w:t>R3</w:t>
             </w:r>
           </w:p>
         </w:tc>
@@ -3106,7 +3713,7 @@
               <w:rPr>
                 <w:sz w:val="19"/>
               </w:rPr>
-              <w:t>R5</w:t>
+              <w:t>R4</w:t>
             </w:r>
           </w:p>
         </w:tc>
@@ -3120,7 +3727,7 @@
               <w:rPr>
                 <w:sz w:val="19"/>
               </w:rPr>
-              <w:t>One sample inbound file and one sample response file, for each of the four scenarios</w:t>
+              <w:t>One sample inbound file and one sample response file, for each of the five scenarios</w:t>
             </w:r>
           </w:p>
         </w:tc>
@@ -3150,7 +3757,7 @@
               <w:rPr>
                 <w:sz w:val="19"/>
               </w:rPr>
-              <w:t>R6</w:t>
+              <w:t>R5</w:t>
             </w:r>
           </w:p>
         </w:tc>
@@ -3179,6 +3786,94 @@
                 <w:sz w:val="19"/>
               </w:rPr>
               <w:t>The Customizing decides the grouping and the roles at runtime.</w:t>
+            </w:r>
+          </w:p>
+        </w:tc>
+      </w:tr>
+      <w:tr>
+        <w:tc>
+          <w:tcPr>
+            <w:tcW w:type="dxa" w:w="737"/>
+          </w:tcPr>
+          <w:p>
+            <w:r/>
+            <w:r>
+              <w:rPr>
+                <w:sz w:val="19"/>
+              </w:rPr>
+              <w:t>R6</w:t>
+            </w:r>
+          </w:p>
+        </w:tc>
+        <w:tc>
+          <w:tcPr>
+            <w:tcW w:type="dxa" w:w="4082"/>
+          </w:tcPr>
+          <w:p>
+            <w:r/>
+            <w:r>
+              <w:rPr>
+                <w:sz w:val="19"/>
+              </w:rPr>
+              <w:t>ZFI_TAX_TAB - the table definition, and how the three indicators are derived</w:t>
+            </w:r>
+          </w:p>
+        </w:tc>
+        <w:tc>
+          <w:tcPr>
+            <w:tcW w:type="dxa" w:w="4535"/>
+          </w:tcPr>
+          <w:p>
+            <w:r/>
+            <w:r>
+              <w:rPr>
+                <w:sz w:val="19"/>
+              </w:rPr>
+              <w:t>Filled today by a screen enhancement on XK01, which will not exist.</w:t>
+            </w:r>
+          </w:p>
+        </w:tc>
+      </w:tr>
+      <w:tr>
+        <w:tc>
+          <w:tcPr>
+            <w:tcW w:type="dxa" w:w="737"/>
+          </w:tcPr>
+          <w:p>
+            <w:r/>
+            <w:r>
+              <w:rPr>
+                <w:sz w:val="19"/>
+              </w:rPr>
+              <w:t>R7</w:t>
+            </w:r>
+          </w:p>
+        </w:tc>
+        <w:tc>
+          <w:tcPr>
+            <w:tcW w:type="dxa" w:w="4082"/>
+          </w:tcPr>
+          <w:p>
+            <w:r/>
+            <w:r>
+              <w:rPr>
+                <w:sz w:val="19"/>
+              </w:rPr>
+              <w:t>The screen enhancement on XK01 that maintains ZFI_TAX_TAB, if it is a custom development</w:t>
+            </w:r>
+          </w:p>
+        </w:tc>
+        <w:tc>
+          <w:tcPr>
+            <w:tcW w:type="dxa" w:w="4535"/>
+          </w:tcPr>
+          <w:p>
+            <w:r/>
+            <w:r>
+              <w:rPr>
+                <w:sz w:val="19"/>
+              </w:rPr>
+              <w:t>To see what it does before the same is done in code.</w:t>
             </w:r>
           </w:p>
         </w:tc>

</xml_diff>

<commit_message>
docs(cimmra): cut the document down to changes and open points
The customer-facing version now carries only what it is for: the changes
to be made, program by program, and what is still needed from Cipla.

Removed: purpose, what was reviewed, assessment summary, what does not
change, indicative effort, the confirmed-points table and next steps.
Kept and renumbered: the change common to both function modules (1),
the six programs (2.1-2.6, with the reference-vendor steps folded into
2.6), the one open question (Q1) and the objects and access needed
(R1-R7).

Co-Authored-By: Claude Opus 5 <noreply@anthropic.com>
Claude-Session: https://claude.ai/code/session_01ExrHE2iD52RuBywzwgwm2S
</commit_message>
<xml_diff>
--- a/docs/cimmra/Cimmra_Vendor_Interface_S4HANA_BP_Assessment.docx
+++ b/docs/cimmra/Cimmra_Vendor_Interface_S4HANA_BP_Assessment.docx
@@ -11,441 +11,22 @@
       </w:r>
     </w:p>
     <w:p>
-      <w:pPr>
-        <w:pStyle w:val="Heading1"/>
-      </w:pPr>
       <w:r>
-        <w:t>1. Purpose</w:t>
+        <w:rPr>
+          <w:b/>
+          <w:i w:val="0"/>
+          <w:sz w:val="26"/>
+        </w:rPr>
+        <w:t>Changes required for SAP S/4HANA Business Partner</w:t>
       </w:r>
     </w:p>
-    <w:p>
-      <w:r>
-        <w:rPr>
-          <w:b w:val="0"/>
-          <w:i w:val="0"/>
-        </w:rPr>
-        <w:t>This document sets out, program by program, what has to change so that the Cimmra vendor interface creates and maintains Business Partners in S/4HANA instead of vendor master records.</w:t>
-      </w:r>
-    </w:p>
-    <w:p>
-      <w:r>
-        <w:rPr>
-          <w:b w:val="0"/>
-          <w:i w:val="0"/>
-        </w:rPr>
-        <w:t>The inbound file layout and the outbound response mechanism are unchanged. The portal sends the same file it sends today, and receives a response file in the same format.</w:t>
-      </w:r>
-    </w:p>
-    <w:p>
-      <w:r>
-        <w:rPr>
-          <w:b w:val="0"/>
-          <w:i w:val="0"/>
-        </w:rPr>
-        <w:t>Section 7 records the points Cipla has confirmed, the one question still open, and the objects we still need before development starts.</w:t>
-      </w:r>
-    </w:p>
-    <w:p>
-      <w:r>
-        <w:rPr>
-          <w:b w:val="0"/>
-          <w:i/>
-        </w:rPr>
-        <w:t>ZFI_CIMMRA_VENDOR_EXT was received after the first draft of this document and is covered in section 4.6. It is the one program that has to be rewritten.</w:t>
-      </w:r>
-    </w:p>
+    <w:p/>
     <w:p>
       <w:pPr>
         <w:pStyle w:val="Heading1"/>
       </w:pPr>
       <w:r>
-        <w:t>2. What was reviewed</w:t>
-      </w:r>
-    </w:p>
-    <w:tbl>
-      <w:tblPr>
-        <w:tblStyle w:val="LightGrid-Accent1"/>
-        <w:tblW w:type="auto" w:w="0"/>
-        <w:jc w:val="left"/>
-        <w:tblLook w:firstColumn="1" w:firstRow="1" w:lastColumn="0" w:lastRow="0" w:noHBand="0" w:noVBand="1" w:val="04A0"/>
-      </w:tblPr>
-      <w:tblGrid>
-        <w:gridCol w:w="3324"/>
-        <w:gridCol w:w="3324"/>
-        <w:gridCol w:w="3324"/>
-      </w:tblGrid>
-      <w:tr>
-        <w:tc>
-          <w:tcPr>
-            <w:tcW w:type="dxa" w:w="3402"/>
-          </w:tcPr>
-          <w:p>
-            <w:r/>
-            <w:r>
-              <w:rPr>
-                <w:b/>
-                <w:sz w:val="19"/>
-              </w:rPr>
-              <w:t>Object</w:t>
-            </w:r>
-          </w:p>
-        </w:tc>
-        <w:tc>
-          <w:tcPr>
-            <w:tcW w:type="dxa" w:w="1814"/>
-          </w:tcPr>
-          <w:p>
-            <w:r/>
-            <w:r>
-              <w:rPr>
-                <w:b/>
-                <w:sz w:val="19"/>
-              </w:rPr>
-              <w:t>Type</w:t>
-            </w:r>
-          </w:p>
-        </w:tc>
-        <w:tc>
-          <w:tcPr>
-            <w:tcW w:type="dxa" w:w="4139"/>
-          </w:tcPr>
-          <w:p>
-            <w:r/>
-            <w:r>
-              <w:rPr>
-                <w:b/>
-                <w:sz w:val="19"/>
-              </w:rPr>
-              <w:t>Role in the interface</w:t>
-            </w:r>
-          </w:p>
-        </w:tc>
-      </w:tr>
-      <w:tr>
-        <w:tc>
-          <w:tcPr>
-            <w:tcW w:type="dxa" w:w="3402"/>
-          </w:tcPr>
-          <w:p>
-            <w:r/>
-            <w:r>
-              <w:rPr>
-                <w:sz w:val="19"/>
-              </w:rPr>
-              <w:t>ZFI_CIMMRA_VENDOR_CREATE</w:t>
-            </w:r>
-          </w:p>
-        </w:tc>
-        <w:tc>
-          <w:tcPr>
-            <w:tcW w:type="dxa" w:w="1814"/>
-          </w:tcPr>
-          <w:p>
-            <w:r/>
-            <w:r>
-              <w:rPr>
-                <w:sz w:val="19"/>
-              </w:rPr>
-              <w:t>Report</w:t>
-            </w:r>
-          </w:p>
-        </w:tc>
-        <w:tc>
-          <w:tcPr>
-            <w:tcW w:type="dxa" w:w="4139"/>
-          </w:tcPr>
-          <w:p>
-            <w:r/>
-            <w:r>
-              <w:rPr>
-                <w:sz w:val="19"/>
-              </w:rPr>
-              <w:t>Reads the vendor file, calls create or change</w:t>
-            </w:r>
-          </w:p>
-        </w:tc>
-      </w:tr>
-      <w:tr>
-        <w:tc>
-          <w:tcPr>
-            <w:tcW w:type="dxa" w:w="3402"/>
-          </w:tcPr>
-          <w:p>
-            <w:r/>
-            <w:r>
-              <w:rPr>
-                <w:sz w:val="19"/>
-              </w:rPr>
-              <w:t>ZFI_CIMMRA_EMPVEND</w:t>
-            </w:r>
-          </w:p>
-        </w:tc>
-        <w:tc>
-          <w:tcPr>
-            <w:tcW w:type="dxa" w:w="1814"/>
-          </w:tcPr>
-          <w:p>
-            <w:r/>
-            <w:r>
-              <w:rPr>
-                <w:sz w:val="19"/>
-              </w:rPr>
-              <w:t>Report</w:t>
-            </w:r>
-          </w:p>
-        </w:tc>
-        <w:tc>
-          <w:tcPr>
-            <w:tcW w:type="dxa" w:w="4139"/>
-          </w:tcPr>
-          <w:p>
-            <w:r/>
-            <w:r>
-              <w:rPr>
-                <w:sz w:val="19"/>
-              </w:rPr>
-              <w:t>Employee vendor creation</w:t>
-            </w:r>
-          </w:p>
-        </w:tc>
-      </w:tr>
-      <w:tr>
-        <w:tc>
-          <w:tcPr>
-            <w:tcW w:type="dxa" w:w="3402"/>
-          </w:tcPr>
-          <w:p>
-            <w:r/>
-            <w:r>
-              <w:rPr>
-                <w:sz w:val="19"/>
-              </w:rPr>
-              <w:t>ZFI_CIMMRA_EMPVEND_UPD</w:t>
-            </w:r>
-          </w:p>
-        </w:tc>
-        <w:tc>
-          <w:tcPr>
-            <w:tcW w:type="dxa" w:w="1814"/>
-          </w:tcPr>
-          <w:p>
-            <w:r/>
-            <w:r>
-              <w:rPr>
-                <w:sz w:val="19"/>
-              </w:rPr>
-              <w:t>Report</w:t>
-            </w:r>
-          </w:p>
-        </w:tc>
-        <w:tc>
-          <w:tcPr>
-            <w:tcW w:type="dxa" w:w="4139"/>
-          </w:tcPr>
-          <w:p>
-            <w:r/>
-            <w:r>
-              <w:rPr>
-                <w:sz w:val="19"/>
-              </w:rPr>
-              <w:t>Employee vendor change</w:t>
-            </w:r>
-          </w:p>
-        </w:tc>
-      </w:tr>
-      <w:tr>
-        <w:tc>
-          <w:tcPr>
-            <w:tcW w:type="dxa" w:w="3402"/>
-          </w:tcPr>
-          <w:p>
-            <w:r/>
-            <w:r>
-              <w:rPr>
-                <w:sz w:val="19"/>
-              </w:rPr>
-              <w:t>ZFI_CIMMRA_BANK_CREATE</w:t>
-            </w:r>
-          </w:p>
-        </w:tc>
-        <w:tc>
-          <w:tcPr>
-            <w:tcW w:type="dxa" w:w="1814"/>
-          </w:tcPr>
-          <w:p>
-            <w:r/>
-            <w:r>
-              <w:rPr>
-                <w:sz w:val="19"/>
-              </w:rPr>
-              <w:t>Report</w:t>
-            </w:r>
-          </w:p>
-        </w:tc>
-        <w:tc>
-          <w:tcPr>
-            <w:tcW w:type="dxa" w:w="4139"/>
-          </w:tcPr>
-          <w:p>
-            <w:r/>
-            <w:r>
-              <w:rPr>
-                <w:sz w:val="19"/>
-              </w:rPr>
-              <w:t>Bank key creation</w:t>
-            </w:r>
-          </w:p>
-        </w:tc>
-      </w:tr>
-      <w:tr>
-        <w:tc>
-          <w:tcPr>
-            <w:tcW w:type="dxa" w:w="3402"/>
-          </w:tcPr>
-          <w:p>
-            <w:r/>
-            <w:r>
-              <w:rPr>
-                <w:sz w:val="19"/>
-              </w:rPr>
-              <w:t>ZFI_CIMMRA_VENDOR_EXT</w:t>
-            </w:r>
-          </w:p>
-        </w:tc>
-        <w:tc>
-          <w:tcPr>
-            <w:tcW w:type="dxa" w:w="1814"/>
-          </w:tcPr>
-          <w:p>
-            <w:r/>
-            <w:r>
-              <w:rPr>
-                <w:sz w:val="19"/>
-              </w:rPr>
-              <w:t>Report</w:t>
-            </w:r>
-          </w:p>
-        </w:tc>
-        <w:tc>
-          <w:tcPr>
-            <w:tcW w:type="dxa" w:w="4139"/>
-          </w:tcPr>
-          <w:p>
-            <w:r/>
-            <w:r>
-              <w:rPr>
-                <w:sz w:val="19"/>
-              </w:rPr>
-              <w:t>Extends a vendor to a further company code and purchasing organisation</w:t>
-            </w:r>
-          </w:p>
-        </w:tc>
-      </w:tr>
-      <w:tr>
-        <w:tc>
-          <w:tcPr>
-            <w:tcW w:type="dxa" w:w="3402"/>
-          </w:tcPr>
-          <w:p>
-            <w:r/>
-            <w:r>
-              <w:rPr>
-                <w:sz w:val="19"/>
-              </w:rPr>
-              <w:t>ZMM_RFC_VENDOR_CREATE</w:t>
-            </w:r>
-          </w:p>
-        </w:tc>
-        <w:tc>
-          <w:tcPr>
-            <w:tcW w:type="dxa" w:w="1814"/>
-          </w:tcPr>
-          <w:p>
-            <w:r/>
-            <w:r>
-              <w:rPr>
-                <w:sz w:val="19"/>
-              </w:rPr>
-              <w:t>Function module</w:t>
-            </w:r>
-          </w:p>
-        </w:tc>
-        <w:tc>
-          <w:tcPr>
-            <w:tcW w:type="dxa" w:w="4139"/>
-          </w:tcPr>
-          <w:p>
-            <w:r/>
-            <w:r>
-              <w:rPr>
-                <w:sz w:val="19"/>
-              </w:rPr>
-              <w:t>Builds the master data and posts it</w:t>
-            </w:r>
-          </w:p>
-        </w:tc>
-      </w:tr>
-      <w:tr>
-        <w:tc>
-          <w:tcPr>
-            <w:tcW w:type="dxa" w:w="3402"/>
-          </w:tcPr>
-          <w:p>
-            <w:r/>
-            <w:r>
-              <w:rPr>
-                <w:sz w:val="19"/>
-              </w:rPr>
-              <w:t>ZMM_RFC_VENDOR_CHANGE</w:t>
-            </w:r>
-          </w:p>
-        </w:tc>
-        <w:tc>
-          <w:tcPr>
-            <w:tcW w:type="dxa" w:w="1814"/>
-          </w:tcPr>
-          <w:p>
-            <w:r/>
-            <w:r>
-              <w:rPr>
-                <w:sz w:val="19"/>
-              </w:rPr>
-              <w:t>Function module</w:t>
-            </w:r>
-          </w:p>
-        </w:tc>
-        <w:tc>
-          <w:tcPr>
-            <w:tcW w:type="dxa" w:w="4139"/>
-          </w:tcPr>
-          <w:p>
-            <w:r/>
-            <w:r>
-              <w:rPr>
-                <w:sz w:val="19"/>
-              </w:rPr>
-              <w:t>Builds the changes and posts them</w:t>
-            </w:r>
-          </w:p>
-        </w:tc>
-      </w:tr>
-    </w:tbl>
-    <w:p/>
-    <w:p>
-      <w:r>
-        <w:rPr>
-          <w:b w:val="0"/>
-          <w:i w:val="0"/>
-        </w:rPr>
-        <w:t>Also reviewed: "Cimmra Vendor Portal Integration with SAP Vendor Master", which describes the process flow, the SFTP and AL11 directories, and the response file.</w:t>
-      </w:r>
-    </w:p>
-    <w:p>
-      <w:pPr>
-        <w:pStyle w:val="Heading1"/>
-      </w:pPr>
-      <w:r>
-        <w:t>3. The change that applies to both function modules</w:t>
+        <w:t>1. The change common to both function modules</w:t>
       </w:r>
     </w:p>
     <w:p>
@@ -460,10 +41,10 @@
     <w:p>
       <w:r>
         <w:rPr>
-          <w:b/>
+          <w:b w:val="0"/>
           <w:i w:val="0"/>
         </w:rPr>
-        <w:t>Six points follow from that change.</w:t>
+        <w:t>The field mapping, which is the bulk of both function modules, is reused unchanged. What is added is the Business Partner half of the same message, and six points follow from that.</w:t>
       </w:r>
     </w:p>
     <w:tbl>
@@ -536,7 +117,7 @@
               <w:rPr>
                 <w:sz w:val="19"/>
               </w:rPr>
-              <w:t>3.1</w:t>
+              <w:t>1.1</w:t>
             </w:r>
           </w:p>
         </w:tc>
@@ -580,7 +161,7 @@
               <w:rPr>
                 <w:sz w:val="19"/>
               </w:rPr>
-              <w:t>3.2</w:t>
+              <w:t>1.2</w:t>
             </w:r>
           </w:p>
         </w:tc>
@@ -608,7 +189,7 @@
               <w:rPr>
                 <w:sz w:val="19"/>
               </w:rPr>
-              <w:t>The interface refuses a message that does not name the partner, even when the number is still to be assigned. A creation is identified by a generated GUID, which becomes the new partner’s key; a change is identified by the GUID the CVI link table already holds.</w:t>
+              <w:t>The interface refuses a message that does not name the partner, even when the number is still to be assigned. A creation is identified by a generated GUID, which becomes the new partner’s key; a change is identified by the GUID the CVI link table already holds, read from the vendor number the portal sends.</w:t>
             </w:r>
           </w:p>
         </w:tc>
@@ -624,7 +205,7 @@
               <w:rPr>
                 <w:sz w:val="19"/>
               </w:rPr>
-              <w:t>3.3</w:t>
+              <w:t>1.3</w:t>
             </w:r>
           </w:p>
         </w:tc>
@@ -668,7 +249,7 @@
               <w:rPr>
                 <w:sz w:val="19"/>
               </w:rPr>
-              <w:t>3.4</w:t>
+              <w:t>1.4</w:t>
             </w:r>
           </w:p>
         </w:tc>
@@ -712,7 +293,7 @@
               <w:rPr>
                 <w:sz w:val="19"/>
               </w:rPr>
-              <w:t>3.5</w:t>
+              <w:t>1.5</w:t>
             </w:r>
           </w:p>
         </w:tc>
@@ -756,7 +337,7 @@
               <w:rPr>
                 <w:sz w:val="19"/>
               </w:rPr>
-              <w:t>3.6</w:t>
+              <w:t>1.6</w:t>
             </w:r>
           </w:p>
         </w:tc>
@@ -796,7 +377,7 @@
         <w:pStyle w:val="Heading1"/>
       </w:pPr>
       <w:r>
-        <w:t>4. Changes by program</w:t>
+        <w:t>2. Changes by program</w:t>
       </w:r>
     </w:p>
     <w:p>
@@ -804,7 +385,7 @@
         <w:pStyle w:val="Heading2"/>
       </w:pPr>
       <w:r>
-        <w:t>4.1  ZMM_RFC_VENDOR_CREATE  (function module)</w:t>
+        <w:t>2.1  ZMM_RFC_VENDOR_CREATE  (function module)</w:t>
       </w:r>
     </w:p>
     <w:tbl>
@@ -1225,7 +806,7 @@
         <w:pStyle w:val="Heading2"/>
       </w:pPr>
       <w:r>
-        <w:t>4.2  ZMM_RFC_VENDOR_CHANGE  (function module)</w:t>
+        <w:t>2.2  ZMM_RFC_VENDOR_CHANGE  (function module)</w:t>
       </w:r>
     </w:p>
     <w:tbl>
@@ -1356,7 +937,7 @@
               <w:rPr>
                 <w:sz w:val="19"/>
               </w:rPr>
-              <w:t>As 4.1</w:t>
+              <w:t>As 2.1</w:t>
             </w:r>
           </w:p>
         </w:tc>
@@ -1400,7 +981,51 @@
               <w:rPr>
                 <w:sz w:val="19"/>
               </w:rPr>
-              <w:t>As 4.1 - the same routine</w:t>
+              <w:t>As 2.1 - the same routine</w:t>
+            </w:r>
+          </w:p>
+        </w:tc>
+        <w:tc>
+          <w:tcPr>
+            <w:tcW w:type="dxa" w:w="1417"/>
+          </w:tcPr>
+          <w:p>
+            <w:r/>
+            <w:r>
+              <w:rPr>
+                <w:sz w:val="19"/>
+              </w:rPr>
+              <w:t>Small</w:t>
+            </w:r>
+          </w:p>
+        </w:tc>
+      </w:tr>
+      <w:tr>
+        <w:tc>
+          <w:tcPr>
+            <w:tcW w:type="dxa" w:w="2041"/>
+          </w:tcPr>
+          <w:p>
+            <w:r/>
+            <w:r>
+              <w:rPr>
+                <w:sz w:val="19"/>
+              </w:rPr>
+              <w:t>Record identification</w:t>
+            </w:r>
+          </w:p>
+        </w:tc>
+        <w:tc>
+          <w:tcPr>
+            <w:tcW w:type="dxa" w:w="5896"/>
+          </w:tcPr>
+          <w:p>
+            <w:r/>
+            <w:r>
+              <w:rPr>
+                <w:sz w:val="19"/>
+              </w:rPr>
+              <w:t>The program is keyed on the vendor number today. The Business Partner behind it is read from the CVI link table, so the change works whether or not the two numbers are the same.</w:t>
             </w:r>
           </w:p>
         </w:tc>
@@ -1488,7 +1113,7 @@
               <w:rPr>
                 <w:sz w:val="19"/>
               </w:rPr>
-              <w:t>As 4.1</w:t>
+              <w:t>As 2.1</w:t>
             </w:r>
           </w:p>
         </w:tc>
@@ -1558,7 +1183,7 @@
         <w:pStyle w:val="Heading2"/>
       </w:pPr>
       <w:r>
-        <w:t>4.3  ZFI_CIMMRA_VENDOR_CREATE  (report)</w:t>
+        <w:t>2.3  ZFI_CIMMRA_VENDOR_CREATE  (report)</w:t>
       </w:r>
     </w:p>
     <w:tbl>
@@ -1645,7 +1270,7 @@
               <w:rPr>
                 <w:sz w:val="19"/>
               </w:rPr>
-              <w:t>Directory paths are built with a backslash, while the quality paths in the design document are Unix style. The separator is derived at runtime so that the programs run on either platform.</w:t>
+              <w:t>Directory paths are built with a backslash, while the quality paths in the design document are Unix style. The separator is derived at runtime so that the program runs on either platform.</w:t>
             </w:r>
           </w:p>
         </w:tc>
@@ -1777,7 +1402,7 @@
               <w:rPr>
                 <w:sz w:val="19"/>
               </w:rPr>
-              <w:t>Same nine columns. The Business Partner number is added - see question Q3.</w:t>
+              <w:t>Same nine columns. The Business Partner number is added - see question Q1.</w:t>
             </w:r>
           </w:p>
         </w:tc>
@@ -1847,7 +1472,7 @@
         <w:pStyle w:val="Heading2"/>
       </w:pPr>
       <w:r>
-        <w:t>4.4  ZFI_CIMMRA_EMPVEND and ZFI_CIMMRA_EMPVEND_UPD  (reports)</w:t>
+        <w:t>2.4  ZFI_CIMMRA_EMPVEND and ZFI_CIMMRA_EMPVEND_UPD  (reports)</w:t>
       </w:r>
     </w:p>
     <w:tbl>
@@ -1934,7 +1559,7 @@
               <w:rPr>
                 <w:sz w:val="19"/>
               </w:rPr>
-              <w:t>Confirmed by Cipla as a person Business Partner - category 1. That changes the name fields (first name, last name, correspondence language in place of the organisation name), the grouping and the number range. The rest of the two programs is unchanged.</w:t>
+              <w:t>A person Business Partner - category 1, as confirmed by Cipla. That changes the name fields (first name, last name and correspondence language in place of the organisation name), the grouping and the number range.</w:t>
             </w:r>
           </w:p>
         </w:tc>
@@ -1978,7 +1603,7 @@
               <w:rPr>
                 <w:sz w:val="19"/>
               </w:rPr>
-              <w:t>As 4.3</w:t>
+              <w:t>As 2.3</w:t>
             </w:r>
           </w:p>
         </w:tc>
@@ -2004,7 +1629,7 @@
         <w:pStyle w:val="Heading2"/>
       </w:pPr>
       <w:r>
-        <w:t>4.5  ZFI_CIMMRA_BANK_CREATE  (report)</w:t>
+        <w:t>2.5  ZFI_CIMMRA_BANK_CREATE  (report)</w:t>
       </w:r>
     </w:p>
     <w:p>
@@ -2013,7 +1638,7 @@
           <w:b w:val="0"/>
           <w:i w:val="0"/>
         </w:rPr>
-        <w:t>BAPI_BANK_CREATE is unchanged in S/4HANA. Only the file handling points in 4.3 apply. This is the smallest of the five.</w:t>
+        <w:t>BAPI_BANK_CREATE is unchanged in S/4HANA. Only the file handling points in 2.3 apply. This is the smallest of the six.</w:t>
       </w:r>
     </w:p>
     <w:p>
@@ -2021,7 +1646,7 @@
         <w:pStyle w:val="Heading2"/>
       </w:pPr>
       <w:r>
-        <w:t>4.6  ZFI_CIMMRA_VENDOR_EXT  (report)</w:t>
+        <w:t>2.6  ZFI_CIMMRA_VENDOR_EXT  (report)</w:t>
       </w:r>
     </w:p>
     <w:p>
@@ -2149,7 +1774,7 @@
               <w:rPr>
                 <w:sz w:val="19"/>
               </w:rPr>
-              <w:t>The key of the message, and a read of the reference - see the note below</w:t>
+              <w:t>The key of the message, and a read of the reference - see below</w:t>
             </w:r>
           </w:p>
         </w:tc>
@@ -2369,7 +1994,7 @@
               <w:rPr>
                 <w:sz w:val="19"/>
               </w:rPr>
-              <w:t>See the note below</w:t>
+              <w:t>Written by the program itself - see R5 and R6</w:t>
             </w:r>
           </w:p>
         </w:tc>
@@ -2426,913 +2051,7 @@
           <w:b/>
           <w:i w:val="0"/>
         </w:rPr>
-        <w:t>Two points need a decision rather than only development.</w:t>
-      </w:r>
-    </w:p>
-    <w:tbl>
-      <w:tblPr>
-        <w:tblStyle w:val="LightGrid-Accent1"/>
-        <w:tblW w:type="auto" w:w="0"/>
-        <w:jc w:val="left"/>
-        <w:tblLook w:firstColumn="1" w:firstRow="1" w:lastColumn="0" w:lastRow="0" w:noHBand="0" w:noVBand="1" w:val="04A0"/>
-      </w:tblPr>
-      <w:tblGrid>
-        <w:gridCol w:w="3324"/>
-        <w:gridCol w:w="3324"/>
-        <w:gridCol w:w="3324"/>
-      </w:tblGrid>
-      <w:tr>
-        <w:tc>
-          <w:tcPr>
-            <w:tcW w:type="dxa" w:w="737"/>
-          </w:tcPr>
-          <w:p>
-            <w:r/>
-            <w:r>
-              <w:rPr>
-                <w:b/>
-                <w:sz w:val="19"/>
-              </w:rPr>
-              <w:t>#</w:t>
-            </w:r>
-          </w:p>
-        </w:tc>
-        <w:tc>
-          <w:tcPr>
-            <w:tcW w:type="dxa" w:w="2494"/>
-          </w:tcPr>
-          <w:p>
-            <w:r/>
-            <w:r>
-              <w:rPr>
-                <w:b/>
-                <w:sz w:val="19"/>
-              </w:rPr>
-              <w:t>Point</w:t>
-            </w:r>
-          </w:p>
-        </w:tc>
-        <w:tc>
-          <w:tcPr>
-            <w:tcW w:type="dxa" w:w="6123"/>
-          </w:tcPr>
-          <w:p>
-            <w:r/>
-            <w:r>
-              <w:rPr>
-                <w:b/>
-                <w:sz w:val="19"/>
-              </w:rPr>
-              <w:t>What it means</w:t>
-            </w:r>
-          </w:p>
-        </w:tc>
-      </w:tr>
-      <w:tr>
-        <w:tc>
-          <w:tcPr>
-            <w:tcW w:type="dxa" w:w="737"/>
-          </w:tcPr>
-          <w:p>
-            <w:r/>
-            <w:r>
-              <w:rPr>
-                <w:sz w:val="19"/>
-              </w:rPr>
-              <w:t>A</w:t>
-            </w:r>
-          </w:p>
-        </w:tc>
-        <w:tc>
-          <w:tcPr>
-            <w:tcW w:type="dxa" w:w="2494"/>
-          </w:tcPr>
-          <w:p>
-            <w:r/>
-            <w:r>
-              <w:rPr>
-                <w:sz w:val="19"/>
-              </w:rPr>
-              <w:t>The reference vendor</w:t>
-            </w:r>
-          </w:p>
-        </w:tc>
-        <w:tc>
-          <w:tcPr>
-            <w:tcW w:type="dxa" w:w="6123"/>
-          </w:tcPr>
-          <w:p>
-            <w:r/>
-            <w:r>
-              <w:rPr>
-                <w:sz w:val="19"/>
-              </w:rPr>
-              <w:t>Settled. On the screen, naming a reference vendor copied everything the reference had, and the Business Partner interface has no such feature. The new program reads the reference with VMD_EI_API_EXTRACT=&gt;GET_DATA - the same call the download program already uses - and passes what comes back to the class after re-keying it. No field list has to be agreed. Section 7.2 sets out the four steps.</w:t>
-            </w:r>
-          </w:p>
-        </w:tc>
-      </w:tr>
-      <w:tr>
-        <w:tc>
-          <w:tcPr>
-            <w:tcW w:type="dxa" w:w="737"/>
-          </w:tcPr>
-          <w:p>
-            <w:r/>
-            <w:r>
-              <w:rPr>
-                <w:sz w:val="19"/>
-              </w:rPr>
-              <w:t>B</w:t>
-            </w:r>
-          </w:p>
-        </w:tc>
-        <w:tc>
-          <w:tcPr>
-            <w:tcW w:type="dxa" w:w="2494"/>
-          </w:tcPr>
-          <w:p>
-            <w:r/>
-            <w:r>
-              <w:rPr>
-                <w:sz w:val="19"/>
-              </w:rPr>
-              <w:t>ZFI_TAX_TAB</w:t>
-            </w:r>
-          </w:p>
-        </w:tc>
-        <w:tc>
-          <w:tcPr>
-            <w:tcW w:type="dxa" w:w="6123"/>
-          </w:tcPr>
-          <w:p>
-            <w:r/>
-            <w:r>
-              <w:rPr>
-                <w:sz w:val="19"/>
-              </w:rPr>
-              <w:t>A custom table filled today through a screen enhancement on XK01. Without the transaction there is no screen, so the program writes the table itself. This needs the table definition and its update rules. See requirements R5 and R6.</w:t>
-            </w:r>
-          </w:p>
-        </w:tc>
-      </w:tr>
-    </w:tbl>
-    <w:p/>
-    <w:p>
-      <w:r>
-        <w:rPr>
-          <w:b w:val="0"/>
-          <w:i w:val="0"/>
-        </w:rPr>
-        <w:t>The program also reads J_1IMOVEND directly, which is obsolete in S/4HANA - those fields are columns of LFA1 now. And the file handling points in 4.3 apply to it as they do to the other reports.</w:t>
-      </w:r>
-    </w:p>
-    <w:p>
-      <w:pPr>
-        <w:pStyle w:val="Heading1"/>
-      </w:pPr>
-      <w:r>
-        <w:t>5. What does not change</w:t>
-      </w:r>
-    </w:p>
-    <w:p>
-      <w:pPr>
-        <w:pStyle w:val="ListBullet"/>
-      </w:pPr>
-      <w:r>
-        <w:t>The inbound file layout. The portal sends the same file.</w:t>
-      </w:r>
-    </w:p>
-    <w:p>
-      <w:pPr>
-        <w:pStyle w:val="ListBullet"/>
-      </w:pPr>
-      <w:r>
-        <w:t>The SFTP and AL11 directory structure and the PI/PO channels.</w:t>
-      </w:r>
-    </w:p>
-    <w:p>
-      <w:pPr>
-        <w:pStyle w:val="ListBullet"/>
-      </w:pPr>
-      <w:r>
-        <w:t>The response file format - the same columns, in the same order.</w:t>
-      </w:r>
-    </w:p>
-    <w:p>
-      <w:pPr>
-        <w:pStyle w:val="ListBullet"/>
-      </w:pPr>
-      <w:r>
-        <w:t>The background job and its fifteen minute schedule.</w:t>
-      </w:r>
-    </w:p>
-    <w:p>
-      <w:pPr>
-        <w:pStyle w:val="ListBullet"/>
-      </w:pPr>
-      <w:r>
-        <w:t>The field mapping inside both function modules.</w:t>
-      </w:r>
-    </w:p>
-    <w:p>
-      <w:pPr>
-        <w:pStyle w:val="Heading1"/>
-      </w:pPr>
-      <w:r>
-        <w:t>6. Indicative effort</w:t>
-      </w:r>
-    </w:p>
-    <w:tbl>
-      <w:tblPr>
-        <w:tblStyle w:val="LightGrid-Accent1"/>
-        <w:tblW w:type="auto" w:w="0"/>
-        <w:jc w:val="left"/>
-        <w:tblLook w:firstColumn="1" w:firstRow="1" w:lastColumn="0" w:lastRow="0" w:noHBand="0" w:noVBand="1" w:val="04A0"/>
-      </w:tblPr>
-      <w:tblGrid>
-        <w:gridCol w:w="4986"/>
-        <w:gridCol w:w="4986"/>
-      </w:tblGrid>
-      <w:tr>
-        <w:tc>
-          <w:tcPr>
-            <w:tcW w:type="dxa" w:w="4535"/>
-          </w:tcPr>
-          <w:p>
-            <w:r/>
-            <w:r>
-              <w:rPr>
-                <w:b/>
-                <w:sz w:val="19"/>
-              </w:rPr>
-              <w:t>Object</w:t>
-            </w:r>
-          </w:p>
-        </w:tc>
-        <w:tc>
-          <w:tcPr>
-            <w:tcW w:type="dxa" w:w="4819"/>
-          </w:tcPr>
-          <w:p>
-            <w:r/>
-            <w:r>
-              <w:rPr>
-                <w:b/>
-                <w:sz w:val="19"/>
-              </w:rPr>
-              <w:t>Relative effort</w:t>
-            </w:r>
-          </w:p>
-        </w:tc>
-      </w:tr>
-      <w:tr>
-        <w:tc>
-          <w:tcPr>
-            <w:tcW w:type="dxa" w:w="4535"/>
-          </w:tcPr>
-          <w:p>
-            <w:r/>
-            <w:r>
-              <w:rPr>
-                <w:sz w:val="19"/>
-              </w:rPr>
-              <w:t>ZMM_RFC_VENDOR_CREATE</w:t>
-            </w:r>
-          </w:p>
-        </w:tc>
-        <w:tc>
-          <w:tcPr>
-            <w:tcW w:type="dxa" w:w="4819"/>
-          </w:tcPr>
-          <w:p>
-            <w:r/>
-            <w:r>
-              <w:rPr>
-                <w:sz w:val="19"/>
-              </w:rPr>
-              <w:t>Largest of the six</w:t>
-            </w:r>
-          </w:p>
-        </w:tc>
-      </w:tr>
-      <w:tr>
-        <w:tc>
-          <w:tcPr>
-            <w:tcW w:type="dxa" w:w="4535"/>
-          </w:tcPr>
-          <w:p>
-            <w:r/>
-            <w:r>
-              <w:rPr>
-                <w:sz w:val="19"/>
-              </w:rPr>
-              <w:t>ZMM_RFC_VENDOR_CHANGE</w:t>
-            </w:r>
-          </w:p>
-        </w:tc>
-        <w:tc>
-          <w:tcPr>
-            <w:tcW w:type="dxa" w:w="4819"/>
-          </w:tcPr>
-          <w:p>
-            <w:r/>
-            <w:r>
-              <w:rPr>
-                <w:sz w:val="19"/>
-              </w:rPr>
-              <w:t>Comparable, plus the task codes and the repeating data</w:t>
-            </w:r>
-          </w:p>
-        </w:tc>
-      </w:tr>
-      <w:tr>
-        <w:tc>
-          <w:tcPr>
-            <w:tcW w:type="dxa" w:w="4535"/>
-          </w:tcPr>
-          <w:p>
-            <w:r/>
-            <w:r>
-              <w:rPr>
-                <w:sz w:val="19"/>
-              </w:rPr>
-              <w:t>ZFI_CIMMRA_VENDOR_CREATE</w:t>
-            </w:r>
-          </w:p>
-        </w:tc>
-        <w:tc>
-          <w:tcPr>
-            <w:tcW w:type="dxa" w:w="4819"/>
-          </w:tcPr>
-          <w:p>
-            <w:r/>
-            <w:r>
-              <w:rPr>
-                <w:sz w:val="19"/>
-              </w:rPr>
-              <w:t>Small</w:t>
-            </w:r>
-          </w:p>
-        </w:tc>
-      </w:tr>
-      <w:tr>
-        <w:tc>
-          <w:tcPr>
-            <w:tcW w:type="dxa" w:w="4535"/>
-          </w:tcPr>
-          <w:p>
-            <w:r/>
-            <w:r>
-              <w:rPr>
-                <w:sz w:val="19"/>
-              </w:rPr>
-              <w:t>ZFI_CIMMRA_EMPVEND / _UPD</w:t>
-            </w:r>
-          </w:p>
-        </w:tc>
-        <w:tc>
-          <w:tcPr>
-            <w:tcW w:type="dxa" w:w="4819"/>
-          </w:tcPr>
-          <w:p>
-            <w:r/>
-            <w:r>
-              <w:rPr>
-                <w:sz w:val="19"/>
-              </w:rPr>
-              <w:t>Small each</w:t>
-            </w:r>
-          </w:p>
-        </w:tc>
-      </w:tr>
-      <w:tr>
-        <w:tc>
-          <w:tcPr>
-            <w:tcW w:type="dxa" w:w="4535"/>
-          </w:tcPr>
-          <w:p>
-            <w:r/>
-            <w:r>
-              <w:rPr>
-                <w:sz w:val="19"/>
-              </w:rPr>
-              <w:t>ZFI_CIMMRA_BANK_CREATE</w:t>
-            </w:r>
-          </w:p>
-        </w:tc>
-        <w:tc>
-          <w:tcPr>
-            <w:tcW w:type="dxa" w:w="4819"/>
-          </w:tcPr>
-          <w:p>
-            <w:r/>
-            <w:r>
-              <w:rPr>
-                <w:sz w:val="19"/>
-              </w:rPr>
-              <w:t>Very small</w:t>
-            </w:r>
-          </w:p>
-        </w:tc>
-      </w:tr>
-      <w:tr>
-        <w:tc>
-          <w:tcPr>
-            <w:tcW w:type="dxa" w:w="4535"/>
-          </w:tcPr>
-          <w:p>
-            <w:r/>
-            <w:r>
-              <w:rPr>
-                <w:sz w:val="19"/>
-              </w:rPr>
-              <w:t>ZFI_CIMMRA_VENDOR_EXT</w:t>
-            </w:r>
-          </w:p>
-        </w:tc>
-        <w:tc>
-          <w:tcPr>
-            <w:tcW w:type="dxa" w:w="4819"/>
-          </w:tcPr>
-          <w:p>
-            <w:r/>
-            <w:r>
-              <w:rPr>
-                <w:sz w:val="19"/>
-              </w:rPr>
-              <w:t>Rewritten rather than adapted, but the field set is small - comparable to one of the reports</w:t>
-            </w:r>
-          </w:p>
-        </w:tc>
-      </w:tr>
-    </w:tbl>
-    <w:p/>
-    <w:p>
-      <w:r>
-        <w:rPr>
-          <w:b w:val="0"/>
-          <w:i w:val="0"/>
-        </w:rPr>
-        <w:t>The Business Partner node is written once and used by both function modules. A firm estimate follows once the objects in section 7.4 are available.</w:t>
-      </w:r>
-    </w:p>
-    <w:p>
-      <w:pPr>
-        <w:pStyle w:val="Heading1"/>
-      </w:pPr>
-      <w:r>
-        <w:t>7. Confirmed points, and what is still needed</w:t>
-      </w:r>
-    </w:p>
-    <w:p>
-      <w:r>
-        <w:rPr>
-          <w:b w:val="0"/>
-          <w:i/>
-        </w:rPr>
-        <w:t>Cipla has answered six of the seven points raised in the first draft. They are recorded below so that the answers are on file, together with what each one means for the development. One question remains open, and the objects listed in 7.3 are still needed.</w:t>
-      </w:r>
-    </w:p>
-    <w:p>
-      <w:pPr>
-        <w:pStyle w:val="Heading2"/>
-      </w:pPr>
-      <w:r>
-        <w:t>7.1  Points confirmed by Cipla</w:t>
-      </w:r>
-    </w:p>
-    <w:tbl>
-      <w:tblPr>
-        <w:tblStyle w:val="LightGrid-Accent1"/>
-        <w:tblW w:type="auto" w:w="0"/>
-        <w:jc w:val="left"/>
-        <w:tblLook w:firstColumn="1" w:firstRow="1" w:lastColumn="0" w:lastRow="0" w:noHBand="0" w:noVBand="1" w:val="04A0"/>
-      </w:tblPr>
-      <w:tblGrid>
-        <w:gridCol w:w="2493"/>
-        <w:gridCol w:w="2493"/>
-        <w:gridCol w:w="2493"/>
-        <w:gridCol w:w="2493"/>
-      </w:tblGrid>
-      <w:tr>
-        <w:tc>
-          <w:tcPr>
-            <w:tcW w:type="dxa" w:w="680"/>
-          </w:tcPr>
-          <w:p>
-            <w:r/>
-            <w:r>
-              <w:rPr>
-                <w:b/>
-                <w:sz w:val="19"/>
-              </w:rPr>
-              <w:t>#</w:t>
-            </w:r>
-          </w:p>
-        </w:tc>
-        <w:tc>
-          <w:tcPr>
-            <w:tcW w:type="dxa" w:w="2041"/>
-          </w:tcPr>
-          <w:p>
-            <w:r/>
-            <w:r>
-              <w:rPr>
-                <w:b/>
-                <w:sz w:val="19"/>
-              </w:rPr>
-              <w:t>Point</w:t>
-            </w:r>
-          </w:p>
-        </w:tc>
-        <w:tc>
-          <w:tcPr>
-            <w:tcW w:type="dxa" w:w="2381"/>
-          </w:tcPr>
-          <w:p>
-            <w:r/>
-            <w:r>
-              <w:rPr>
-                <w:b/>
-                <w:sz w:val="19"/>
-              </w:rPr>
-              <w:t>Answer</w:t>
-            </w:r>
-          </w:p>
-        </w:tc>
-        <w:tc>
-          <w:tcPr>
-            <w:tcW w:type="dxa" w:w="4252"/>
-          </w:tcPr>
-          <w:p>
-            <w:r/>
-            <w:r>
-              <w:rPr>
-                <w:b/>
-                <w:sz w:val="19"/>
-              </w:rPr>
-              <w:t>What we do</w:t>
-            </w:r>
-          </w:p>
-        </w:tc>
-      </w:tr>
-      <w:tr>
-        <w:tc>
-          <w:tcPr>
-            <w:tcW w:type="dxa" w:w="680"/>
-          </w:tcPr>
-          <w:p>
-            <w:r/>
-            <w:r>
-              <w:rPr>
-                <w:sz w:val="19"/>
-              </w:rPr>
-              <w:t>Q1</w:t>
-            </w:r>
-          </w:p>
-        </w:tc>
-        <w:tc>
-          <w:tcPr>
-            <w:tcW w:type="dxa" w:w="2041"/>
-          </w:tcPr>
-          <w:p>
-            <w:r/>
-            <w:r>
-              <w:rPr>
-                <w:sz w:val="19"/>
-              </w:rPr>
-              <w:t>Business Partner category for an employee vendor</w:t>
-            </w:r>
-          </w:p>
-        </w:tc>
-        <w:tc>
-          <w:tcPr>
-            <w:tcW w:type="dxa" w:w="2381"/>
-          </w:tcPr>
-          <w:p>
-            <w:r/>
-            <w:r>
-              <w:rPr>
-                <w:sz w:val="19"/>
-              </w:rPr>
-              <w:t>Person</w:t>
-            </w:r>
-          </w:p>
-        </w:tc>
-        <w:tc>
-          <w:tcPr>
-            <w:tcW w:type="dxa" w:w="4252"/>
-          </w:tcPr>
-          <w:p>
-            <w:r/>
-            <w:r>
-              <w:rPr>
-                <w:sz w:val="19"/>
-              </w:rPr>
-              <w:t>The two employee vendor programs build a person Business Partner - category 1, with first name, last name and correspondence language rather than an organisation name, and the grouping that carries the person number range.</w:t>
-            </w:r>
-          </w:p>
-        </w:tc>
-      </w:tr>
-      <w:tr>
-        <w:tc>
-          <w:tcPr>
-            <w:tcW w:type="dxa" w:w="680"/>
-          </w:tcPr>
-          <w:p>
-            <w:r/>
-            <w:r>
-              <w:rPr>
-                <w:sz w:val="19"/>
-              </w:rPr>
-              <w:t>Q2</w:t>
-            </w:r>
-          </w:p>
-        </w:tc>
-        <w:tc>
-          <w:tcPr>
-            <w:tcW w:type="dxa" w:w="2041"/>
-          </w:tcPr>
-          <w:p>
-            <w:r/>
-            <w:r>
-              <w:rPr>
-                <w:sz w:val="19"/>
-              </w:rPr>
-              <w:t>Same number for the Business Partner and the vendor</w:t>
-            </w:r>
-          </w:p>
-        </w:tc>
-        <w:tc>
-          <w:tcPr>
-            <w:tcW w:type="dxa" w:w="2381"/>
-          </w:tcPr>
-          <w:p>
-            <w:r/>
-            <w:r>
-              <w:rPr>
-                <w:sz w:val="19"/>
-              </w:rPr>
-              <w:t>Follow the logic of the vendor change program</w:t>
-            </w:r>
-          </w:p>
-        </w:tc>
-        <w:tc>
-          <w:tcPr>
-            <w:tcW w:type="dxa" w:w="4252"/>
-          </w:tcPr>
-          <w:p>
-            <w:r/>
-            <w:r>
-              <w:rPr>
-                <w:sz w:val="19"/>
-              </w:rPr>
-              <w:t>Confirmed against the code. ZMM_RFC_VENDOR_CHANGE identifies the record by vendor number alone. The new version reads the Business Partner from that vendor number through the CVI link table, so it works whether or not the two numbers are the same, and no Customizing decision is needed to start.</w:t>
-            </w:r>
-          </w:p>
-        </w:tc>
-      </w:tr>
-      <w:tr>
-        <w:tc>
-          <w:tcPr>
-            <w:tcW w:type="dxa" w:w="680"/>
-          </w:tcPr>
-          <w:p>
-            <w:r/>
-            <w:r>
-              <w:rPr>
-                <w:sz w:val="19"/>
-              </w:rPr>
-              <w:t>Q4</w:t>
-            </w:r>
-          </w:p>
-        </w:tc>
-        <w:tc>
-          <w:tcPr>
-            <w:tcW w:type="dxa" w:w="2041"/>
-          </w:tcPr>
-          <w:p>
-            <w:r/>
-            <w:r>
-              <w:rPr>
-                <w:sz w:val="19"/>
-              </w:rPr>
-              <w:t>Customer side</w:t>
-            </w:r>
-          </w:p>
-        </w:tc>
-        <w:tc>
-          <w:tcPr>
-            <w:tcW w:type="dxa" w:w="2381"/>
-          </w:tcPr>
-          <w:p>
-            <w:r/>
-            <w:r>
-              <w:rPr>
-                <w:sz w:val="19"/>
-              </w:rPr>
-              <w:t>Not in scope</w:t>
-            </w:r>
-          </w:p>
-        </w:tc>
-        <w:tc>
-          <w:tcPr>
-            <w:tcW w:type="dxa" w:w="4252"/>
-          </w:tcPr>
-          <w:p>
-            <w:r/>
-            <w:r>
-              <w:rPr>
-                <w:sz w:val="19"/>
-              </w:rPr>
-              <w:t>The vendor programs only. No customer program is expected and none is estimated.</w:t>
-            </w:r>
-          </w:p>
-        </w:tc>
-      </w:tr>
-      <w:tr>
-        <w:tc>
-          <w:tcPr>
-            <w:tcW w:type="dxa" w:w="680"/>
-          </w:tcPr>
-          <w:p>
-            <w:r/>
-            <w:r>
-              <w:rPr>
-                <w:sz w:val="19"/>
-              </w:rPr>
-              <w:t>Q5</w:t>
-            </w:r>
-          </w:p>
-        </w:tc>
-        <w:tc>
-          <w:tcPr>
-            <w:tcW w:type="dxa" w:w="2041"/>
-          </w:tcPr>
-          <w:p>
-            <w:r/>
-            <w:r>
-              <w:rPr>
-                <w:sz w:val="19"/>
-              </w:rPr>
-              <w:t>Operating system of the application server</w:t>
-            </w:r>
-          </w:p>
-        </w:tc>
-        <w:tc>
-          <w:tcPr>
-            <w:tcW w:type="dxa" w:w="2381"/>
-          </w:tcPr>
-          <w:p>
-            <w:r/>
-            <w:r>
-              <w:rPr>
-                <w:sz w:val="19"/>
-              </w:rPr>
-              <w:t>Does not matter</w:t>
-            </w:r>
-          </w:p>
-        </w:tc>
-        <w:tc>
-          <w:tcPr>
-            <w:tcW w:type="dxa" w:w="4252"/>
-          </w:tcPr>
-          <w:p>
-            <w:r/>
-            <w:r>
-              <w:rPr>
-                <w:sz w:val="19"/>
-              </w:rPr>
-              <w:t>The path separator is derived at runtime instead of being asked for, so the programs run on either platform.</w:t>
-            </w:r>
-          </w:p>
-        </w:tc>
-      </w:tr>
-      <w:tr>
-        <w:tc>
-          <w:tcPr>
-            <w:tcW w:type="dxa" w:w="680"/>
-          </w:tcPr>
-          <w:p>
-            <w:r/>
-            <w:r>
-              <w:rPr>
-                <w:sz w:val="19"/>
-              </w:rPr>
-              <w:t>Q6</w:t>
-            </w:r>
-          </w:p>
-        </w:tc>
-        <w:tc>
-          <w:tcPr>
-            <w:tcW w:type="dxa" w:w="2041"/>
-          </w:tcPr>
-          <w:p>
-            <w:r/>
-            <w:r>
-              <w:rPr>
-                <w:sz w:val="19"/>
-              </w:rPr>
-              <w:t>Other callers of the two function modules</w:t>
-            </w:r>
-          </w:p>
-        </w:tc>
-        <w:tc>
-          <w:tcPr>
-            <w:tcW w:type="dxa" w:w="2381"/>
-          </w:tcPr>
-          <w:p>
-            <w:r/>
-            <w:r>
-              <w:rPr>
-                <w:sz w:val="19"/>
-              </w:rPr>
-              <w:t>Called from these programs only</w:t>
-            </w:r>
-          </w:p>
-        </w:tc>
-        <w:tc>
-          <w:tcPr>
-            <w:tcW w:type="dxa" w:w="4252"/>
-          </w:tcPr>
-          <w:p>
-            <w:r/>
-            <w:r>
-              <w:rPr>
-                <w:sz w:val="19"/>
-              </w:rPr>
-              <w:t>The interface of the function modules may change where the Business Partner needs it - for example to return the Business Partner number alongside the vendor number. No external caller has to be considered.</w:t>
-            </w:r>
-          </w:p>
-        </w:tc>
-      </w:tr>
-      <w:tr>
-        <w:tc>
-          <w:tcPr>
-            <w:tcW w:type="dxa" w:w="680"/>
-          </w:tcPr>
-          <w:p>
-            <w:r/>
-            <w:r>
-              <w:rPr>
-                <w:sz w:val="19"/>
-              </w:rPr>
-              <w:t>Q7</w:t>
-            </w:r>
-          </w:p>
-        </w:tc>
-        <w:tc>
-          <w:tcPr>
-            <w:tcW w:type="dxa" w:w="2041"/>
-          </w:tcPr>
-          <w:p>
-            <w:r/>
-            <w:r>
-              <w:rPr>
-                <w:sz w:val="19"/>
-              </w:rPr>
-              <w:t>Fields to copy from the reference vendor</w:t>
-            </w:r>
-          </w:p>
-        </w:tc>
-        <w:tc>
-          <w:tcPr>
-            <w:tcW w:type="dxa" w:w="2381"/>
-          </w:tcPr>
-          <w:p>
-            <w:r/>
-            <w:r>
-              <w:rPr>
-                <w:sz w:val="19"/>
-              </w:rPr>
-              <w:t>Read the reference from the tables and pass it to the class, using the same logic as the download program already built</w:t>
-            </w:r>
-          </w:p>
-        </w:tc>
-        <w:tc>
-          <w:tcPr>
-            <w:tcW w:type="dxa" w:w="4252"/>
-          </w:tcPr>
-          <w:p>
-            <w:r/>
-            <w:r>
-              <w:rPr>
-                <w:sz w:val="19"/>
-              </w:rPr>
-              <w:t>Accepted, and it is the better approach. See 7.2.</w:t>
-            </w:r>
-          </w:p>
-        </w:tc>
-      </w:tr>
-    </w:tbl>
-    <w:p/>
-    <w:p>
-      <w:pPr>
-        <w:pStyle w:val="Heading2"/>
-      </w:pPr>
-      <w:r>
-        <w:t>7.2  How the reference vendor is copied</w:t>
+        <w:t>How the reference vendor is copied</w:t>
       </w:r>
     </w:p>
     <w:p>
@@ -3341,16 +2060,7 @@
           <w:b w:val="0"/>
           <w:i w:val="0"/>
         </w:rPr>
-        <w:t>The download program built for the other project reads a supplier with VMD_EI_API_EXTRACT=&gt;GET_DATA. That call returns the complete supplier in VMDS_EI_EXTERN - the same structure CL_MD_BP_MAINTAIN expects on the way in. So the reference is read as a whole and handed back to the class, and no field list has to be agreed in advance.</w:t>
-      </w:r>
-    </w:p>
-    <w:p>
-      <w:r>
-        <w:rPr>
-          <w:b w:val="0"/>
-          <w:i w:val="0"/>
-        </w:rPr>
-        <w:t>The extension therefore runs as four steps.</w:t>
+        <w:t>On the screen, naming a reference vendor copied everything the reference had, and the Business Partner interface has no such feature. The reference is therefore read with VMD_EI_API_EXTRACT=&gt;GET_DATA, which returns the complete supplier in VMDS_EI_EXTERN - the same structure CL_MD_BP_MAINTAIN expects on the way in. So no field list has to be agreed. The extension runs as four steps.</w:t>
       </w:r>
     </w:p>
     <w:p>
@@ -3366,7 +2076,7 @@
         <w:pStyle w:val="ListNumber"/>
       </w:pPr>
       <w:r>
-        <w:t>Re-key what comes back: the header carries the vendor being extended, the company code segment carries the new company code, and the purchasing segment the new purchasing organisation.</w:t>
+        <w:t>Re-key what comes back: the header carries the vendor being extended, the company code segment the new company code, and the purchasing segment the new purchasing organisation.</w:t>
       </w:r>
     </w:p>
     <w:p>
@@ -3391,7 +2101,7 @@
           <w:b w:val="0"/>
           <w:i/>
         </w:rPr>
-        <w:t>Three details are handled inside that, and are named here only so nothing is assumed:</w:t>
+        <w:t>Three details are handled inside that, and are named here only so that nothing is assumed:</w:t>
       </w:r>
     </w:p>
     <w:p>
@@ -3415,7 +2125,24 @@
         <w:pStyle w:val="ListBullet"/>
       </w:pPr>
       <w:r>
-        <w:t>Values that are specific to the reference and must not travel - the previous account number in particular - are cleared rather than copied.</w:t>
+        <w:t>Values specific to the reference and which must not travel - the previous account number in particular - are cleared rather than copied.</w:t>
+      </w:r>
+    </w:p>
+    <w:p>
+      <w:r>
+        <w:rPr>
+          <w:b w:val="0"/>
+          <w:i w:val="0"/>
+        </w:rPr>
+        <w:t>The program also reads J_1IMOVEND directly, which is obsolete in S/4HANA - those fields are columns of LFA1 now. And the file handling points in 2.3 apply to it as they do to the other reports.</w:t>
+      </w:r>
+    </w:p>
+    <w:p>
+      <w:pPr>
+        <w:pStyle w:val="Heading1"/>
+      </w:pPr>
+      <w:r>
+        <w:t>3. What we need from Cipla</w:t>
       </w:r>
     </w:p>
     <w:p>
@@ -3423,7 +2150,7 @@
         <w:pStyle w:val="Heading2"/>
       </w:pPr>
       <w:r>
-        <w:t>7.3  Remaining question</w:t>
+        <w:t>3.1  Question</w:t>
       </w:r>
     </w:p>
     <w:tbl>
@@ -3496,7 +2223,7 @@
               <w:rPr>
                 <w:sz w:val="19"/>
               </w:rPr>
-              <w:t>Q3</w:t>
+              <w:t>Q1</w:t>
             </w:r>
           </w:p>
         </w:tc>
@@ -3524,7 +2251,7 @@
               <w:rPr>
                 <w:sz w:val="19"/>
               </w:rPr>
-              <w:t>Unless the grouping is set for the same number, the Business Partner number and the vendor number are different, and the portal has no way to learn the Business Partner number other than from the response. The portal has to accept whichever form is chosen. Our recommendation is a new column, so the message text stays free.</w:t>
+              <w:t>Unless the grouping is set for the same number, the Business Partner number and the vendor number are different, and the portal has no way to learn the Business Partner number other than from the response. The portal has to accept whichever form is chosen. Our recommendation is a new column, so that the message text stays free.</w:t>
             </w:r>
           </w:p>
         </w:tc>
@@ -3536,7 +2263,7 @@
         <w:pStyle w:val="Heading2"/>
       </w:pPr>
       <w:r>
-        <w:t>7.4  Objects and files we need</w:t>
+        <w:t>3.2  Objects, files and access</w:t>
       </w:r>
     </w:p>
     <w:tbl>
@@ -3862,91 +2589,52 @@
           </w:p>
         </w:tc>
       </w:tr>
+      <w:tr>
+        <w:tc>
+          <w:tcPr>
+            <w:tcW w:type="dxa" w:w="737"/>
+          </w:tcPr>
+          <w:p>
+            <w:r/>
+            <w:r>
+              <w:rPr>
+                <w:sz w:val="19"/>
+              </w:rPr>
+              <w:t>R7</w:t>
+            </w:r>
+          </w:p>
+        </w:tc>
+        <w:tc>
+          <w:tcPr>
+            <w:tcW w:type="dxa" w:w="4082"/>
+          </w:tcPr>
+          <w:p>
+            <w:r/>
+            <w:r>
+              <w:rPr>
+                <w:sz w:val="19"/>
+              </w:rPr>
+              <w:t>Development access, with authorisation to create and change vendor and Business Partner master data, and read access to the AL11 inbound and outbound directories</w:t>
+            </w:r>
+          </w:p>
+        </w:tc>
+        <w:tc>
+          <w:tcPr>
+            <w:tcW w:type="dxa" w:w="4535"/>
+          </w:tcPr>
+          <w:p>
+            <w:r/>
+            <w:r>
+              <w:rPr>
+                <w:sz w:val="19"/>
+              </w:rPr>
+              <w:t>To develop and to test against the real files.</w:t>
+            </w:r>
+          </w:p>
+        </w:tc>
+      </w:tr>
     </w:tbl>
     <w:p/>
-    <w:p>
-      <w:pPr>
-        <w:pStyle w:val="Heading2"/>
-      </w:pPr>
-      <w:r>
-        <w:t>7.5  Access</w:t>
-      </w:r>
-    </w:p>
-    <w:p>
-      <w:pPr>
-        <w:pStyle w:val="ListBullet"/>
-      </w:pPr>
-      <w:r>
-        <w:t>Development access to the S/4HANA development system, with authorisation to create and change vendor and Business Partner master data.</w:t>
-      </w:r>
-    </w:p>
-    <w:p>
-      <w:pPr>
-        <w:pStyle w:val="ListBullet"/>
-      </w:pPr>
-      <w:r>
-        <w:t>Read access to the AL11 inbound and outbound directories used by the interface.</w:t>
-      </w:r>
-    </w:p>
-    <w:p>
-      <w:pPr>
-        <w:pStyle w:val="Heading1"/>
-      </w:pPr>
-      <w:r>
-        <w:t>8. Suggested next steps</w:t>
-      </w:r>
-    </w:p>
-    <w:p>
-      <w:pPr>
-        <w:pStyle w:val="ListNumber"/>
-      </w:pPr>
-      <w:r>
-        <w:t>Cipla answers the one remaining question in 7.3 and provides the objects in 7.4.</w:t>
-      </w:r>
-    </w:p>
-    <w:p>
-      <w:pPr>
-        <w:pStyle w:val="ListNumber"/>
-      </w:pPr>
-      <w:r>
-        <w:t>A working session to walk through the input file and the response file, scenario by scenario.</w:t>
-      </w:r>
-    </w:p>
-    <w:p>
-      <w:pPr>
-        <w:pStyle w:val="ListNumber"/>
-      </w:pPr>
-      <w:r>
-        <w:t>We issue a firm estimate and a technical specification for each program.</w:t>
-      </w:r>
-    </w:p>
-    <w:p>
-      <w:pPr>
-        <w:pStyle w:val="ListNumber"/>
-      </w:pPr>
-      <w:r>
-        <w:t>Development, followed by a unit test in the development system.</w:t>
-      </w:r>
-    </w:p>
-    <w:p>
-      <w:pPr>
-        <w:pStyle w:val="ListNumber"/>
-      </w:pPr>
-      <w:r>
-        <w:t>Cipla runs a user acceptance test with real portal files end to end.</w:t>
-      </w:r>
-    </w:p>
-    <w:p/>
-    <w:p>
-      <w:r>
-        <w:rPr>
-          <w:b w:val="0"/>
-          <w:i/>
-          <w:sz w:val="18"/>
-        </w:rPr>
-        <w:t>Prepared by Diligent Consulting for Cipla Limited. Based on the six programs and the design document received on 07.09.2026 and ZFI_CIMMRA_VENDOR_EXT received on 08.09.2026, and on the points confirmed by Cipla. No program has been changed.</w:t>
-      </w:r>
-    </w:p>
     <w:sectPr>
       <w:pgSz w:w="12240" w:h="15840"/>
       <w:pgMar w:top="1134" w:right="1134" w:bottom="1134" w:left="1134" w:header="720" w:footer="720" w:gutter="0"/>

</xml_diff>